<commit_message>
Make CCVT an interactable obj
</commit_message>
<xml_diff>
--- a/Overall document.docx
+++ b/Overall document.docx
@@ -396,28 +396,14 @@
           <w:b/>
           <w:bCs/>
         </w:rPr>
-        <w:t>Move</w:t>
-      </w:r>
-      <w:r>
-        <w:rPr>
-          <w:b/>
-          <w:bCs/>
-        </w:rPr>
-        <w:t>: Affected positively by AGI, negatively by weight. Weight’s effect is mitigated by Strength.</w:t>
-      </w:r>
-      <w:r>
-        <w:rPr>
-          <w:b/>
-          <w:bCs/>
-        </w:rPr>
-        <w:t xml:space="preserve"> </w:t>
-      </w:r>
-      <w:r>
-        <w:rPr>
-          <w:b/>
-          <w:bCs/>
-        </w:rPr>
-        <w:t>Base move speed is 5m/s. Each point of AGI increases this by 10% (10m/s at 10 AGI).</w:t>
+        <w:t>Move: Affected positively by AGI, negatively by weight. Weight’s effect is mitigated by Strength.</w:t>
+      </w:r>
+      <w:r>
+        <w:rPr>
+          <w:b/>
+          <w:bCs/>
+        </w:rPr>
+        <w:t xml:space="preserve"> Base move speed is 5m/s. Each point of AGI increases this by 10% (10m/s at 10 AGI).</w:t>
       </w:r>
       <w:r>
         <w:rPr>
@@ -489,14 +475,7 @@
           <w:b/>
           <w:bCs/>
         </w:rPr>
-        <w:t>Pick up</w:t>
-      </w:r>
-      <w:r>
-        <w:rPr>
-          <w:b/>
-          <w:bCs/>
-        </w:rPr>
-        <w:t xml:space="preserve">: Picking up stuff will add weight, which will decrease overall speed, which can be mitigated by strength. The act of pick up itself also </w:t>
+        <w:t xml:space="preserve">Pick up: Picking up stuff will add weight, which will decrease overall speed, which can be mitigated by strength. The act of pick up itself also </w:t>
       </w:r>
       <w:proofErr w:type="gramStart"/>
       <w:r>
@@ -654,14 +633,7 @@
           <w:bCs/>
         </w:rPr>
         <w:lastRenderedPageBreak/>
-        <w:t>Takedown</w:t>
-      </w:r>
-      <w:r>
-        <w:rPr>
-          <w:b/>
-          <w:bCs/>
-        </w:rPr>
-        <w:t>: STR will reduce the time needed for takedown</w:t>
+        <w:t>Takedown: STR will reduce the time needed for takedown</w:t>
       </w:r>
       <w:r>
         <w:rPr>
@@ -761,14 +733,7 @@
           <w:b/>
           <w:bCs/>
         </w:rPr>
-        <w:t>Hack</w:t>
-      </w:r>
-      <w:r>
-        <w:rPr>
-          <w:b/>
-          <w:bCs/>
-        </w:rPr>
-        <w:t>: INT will reduce the time needed for hacking</w:t>
+        <w:t>Hack: INT will reduce the time needed for hacking</w:t>
       </w:r>
       <w:r>
         <w:rPr>
@@ -882,14 +847,7 @@
           <w:b/>
           <w:bCs/>
         </w:rPr>
-        <w:t>Use item</w:t>
-      </w:r>
-      <w:r>
-        <w:rPr>
-          <w:b/>
-          <w:bCs/>
-        </w:rPr>
-        <w:t>: INT will reduce the time needed for using item</w:t>
+        <w:t>Use item: INT will reduce the time needed for using item</w:t>
       </w:r>
       <w:r>
         <w:rPr>
@@ -948,14 +906,7 @@
           <w:b/>
           <w:bCs/>
         </w:rPr>
-        <w:t>Escape</w:t>
-      </w:r>
-      <w:r>
-        <w:rPr>
-          <w:b/>
-          <w:bCs/>
-        </w:rPr>
-        <w:t>: Instant but need to be used within 1m of an exit.</w:t>
+        <w:t>Escape: Instant but need to be used within 1m of an exit.</w:t>
       </w:r>
     </w:p>
     <w:p>
@@ -1373,23 +1324,7 @@
           <w:b/>
           <w:bCs/>
         </w:rPr>
-        <w:t xml:space="preserve">m away) and it takes them 3s to shoot. If they cannot shoot you (no clear line of sight or if you are holding a hostage), they will attempt to move closer and change weapon (to a taser). Changing </w:t>
-      </w:r>
-      <w:proofErr w:type="gramStart"/>
-      <w:r>
-        <w:rPr>
-          <w:b/>
-          <w:bCs/>
-        </w:rPr>
-        <w:t>weapon</w:t>
-      </w:r>
-      <w:proofErr w:type="gramEnd"/>
-      <w:r>
-        <w:rPr>
-          <w:b/>
-          <w:bCs/>
-        </w:rPr>
-        <w:t xml:space="preserve"> for guard take 3s. Taser can only be used within </w:t>
+        <w:t xml:space="preserve">m away) and it takes them 3s to shoot. If they cannot shoot you (no clear line of sight or if you are holding a hostage), they will attempt to move closer and change weapon (to a taser). Changing weapon for guard take 3s. Taser can only be used within </w:t>
       </w:r>
       <w:r>
         <w:rPr>
@@ -1563,14 +1498,7 @@
           <w:b/>
           <w:bCs/>
         </w:rPr>
-        <w:t>Test map is an isometric square with 40m edges.</w:t>
-      </w:r>
-      <w:r>
-        <w:rPr>
-          <w:b/>
-          <w:bCs/>
-        </w:rPr>
-        <w:t xml:space="preserve"> With 4 doors at the middle of each wall, 2 windows evenly spaced on each side of each door (8 windows in total). The windows are closed. In the middle of the room there is a locked chest (with a painting inside (10kg obj)</w:t>
+        <w:t>Test map is an isometric square with 40m edges. With 4 doors at the middle of each wall, 2 windows evenly spaced on each side of each door (8 windows in total). The windows are closed. In the middle of the room there is a locked chest (with a painting inside (10kg obj)</w:t>
       </w:r>
       <w:r>
         <w:rPr>
@@ -1741,21 +1669,7 @@
           <w:b/>
           <w:bCs/>
         </w:rPr>
-        <w:t xml:space="preserve"> up with lock </w:t>
-      </w:r>
-      <w:r>
-        <w:rPr>
-          <w:b/>
-          <w:bCs/>
-        </w:rPr>
-        <w:t>(if locked</w:t>
-      </w:r>
-      <w:r>
-        <w:rPr>
-          <w:b/>
-          <w:bCs/>
-        </w:rPr>
-        <w:t xml:space="preserve"> – will add the weight of the lock to the objec</w:t>
+        <w:t xml:space="preserve"> up with lock (if locked – will add the weight of the lock to the objec</w:t>
       </w:r>
       <w:r>
         <w:rPr>
@@ -1769,14 +1683,7 @@
           <w:b/>
           <w:bCs/>
         </w:rPr>
-        <w:t>)</w:t>
-      </w:r>
-      <w:r>
-        <w:rPr>
-          <w:b/>
-          <w:bCs/>
-        </w:rPr>
-        <w:t xml:space="preserve"> or pick up (if not locked). For enemies, it would be </w:t>
+        <w:t xml:space="preserve">) or pick up (if not locked). For enemies, it would be </w:t>
       </w:r>
       <w:proofErr w:type="gramStart"/>
       <w:r>
@@ -2466,6 +2373,265 @@
           <w:bCs/>
         </w:rPr>
       </w:pPr>
+      <w:proofErr w:type="gramStart"/>
+      <w:r>
+        <w:rPr>
+          <w:b/>
+          <w:bCs/>
+        </w:rPr>
+        <w:t>New turn</w:t>
+      </w:r>
+      <w:proofErr w:type="gramEnd"/>
+      <w:r>
+        <w:rPr>
+          <w:b/>
+          <w:bCs/>
+        </w:rPr>
+        <w:t xml:space="preserve"> order: There will be a 10s bar that is used for all characters. (This bar is on the bottom of the screen about 20When time </w:t>
+      </w:r>
+      <w:proofErr w:type="gramStart"/>
+      <w:r>
+        <w:rPr>
+          <w:b/>
+          <w:bCs/>
+        </w:rPr>
+        <w:t>move</w:t>
+      </w:r>
+      <w:proofErr w:type="gramEnd"/>
+      <w:r>
+        <w:rPr>
+          <w:b/>
+          <w:bCs/>
+        </w:rPr>
+        <w:t xml:space="preserve"> and this bar fills </w:t>
+      </w:r>
+      <w:proofErr w:type="gramStart"/>
+      <w:r>
+        <w:rPr>
+          <w:b/>
+          <w:bCs/>
+        </w:rPr>
+        <w:t>up,</w:t>
+      </w:r>
+      <w:proofErr w:type="gramEnd"/>
+      <w:r>
+        <w:rPr>
+          <w:b/>
+          <w:bCs/>
+        </w:rPr>
+        <w:t xml:space="preserve"> enemies will move as scripted and player’s characters will move as programmed. The default move for the character is </w:t>
+      </w:r>
+      <w:proofErr w:type="gramStart"/>
+      <w:r>
+        <w:rPr>
+          <w:b/>
+          <w:bCs/>
+        </w:rPr>
+        <w:t>wait</w:t>
+      </w:r>
+      <w:proofErr w:type="gramEnd"/>
+      <w:r>
+        <w:rPr>
+          <w:b/>
+          <w:bCs/>
+        </w:rPr>
+        <w:t xml:space="preserve"> (do nothing) until there is a new command.</w:t>
+      </w:r>
+    </w:p>
+    <w:p>
+      <w:pPr>
+        <w:rPr>
+          <w:b/>
+          <w:bCs/>
+        </w:rPr>
+      </w:pPr>
+      <w:r>
+        <w:rPr>
+          <w:b/>
+          <w:bCs/>
+        </w:rPr>
+        <w:t xml:space="preserve">This 10s bar is like a </w:t>
+      </w:r>
+      <w:proofErr w:type="gramStart"/>
+      <w:r>
+        <w:rPr>
+          <w:b/>
+          <w:bCs/>
+        </w:rPr>
+        <w:t>movie,</w:t>
+      </w:r>
+      <w:proofErr w:type="gramEnd"/>
+      <w:r>
+        <w:rPr>
+          <w:b/>
+          <w:bCs/>
+        </w:rPr>
+        <w:t xml:space="preserve"> you can move it back and forth by dragging the line that </w:t>
+      </w:r>
+      <w:proofErr w:type="gramStart"/>
+      <w:r>
+        <w:rPr>
+          <w:b/>
+          <w:bCs/>
+        </w:rPr>
+        <w:t>run</w:t>
+      </w:r>
+      <w:proofErr w:type="gramEnd"/>
+      <w:r>
+        <w:rPr>
+          <w:b/>
+          <w:bCs/>
+        </w:rPr>
+        <w:t xml:space="preserve"> in the bar.</w:t>
+      </w:r>
+    </w:p>
+    <w:p>
+      <w:pPr>
+        <w:rPr>
+          <w:b/>
+          <w:bCs/>
+        </w:rPr>
+      </w:pPr>
+      <w:r>
+        <w:rPr>
+          <w:b/>
+          <w:bCs/>
+        </w:rPr>
+        <w:t xml:space="preserve">Under the bar, there are 3 more bars that </w:t>
+      </w:r>
+      <w:proofErr w:type="gramStart"/>
+      <w:r>
+        <w:rPr>
+          <w:b/>
+          <w:bCs/>
+        </w:rPr>
+        <w:t>belongs</w:t>
+      </w:r>
+      <w:proofErr w:type="gramEnd"/>
+      <w:r>
+        <w:rPr>
+          <w:b/>
+          <w:bCs/>
+        </w:rPr>
+        <w:t xml:space="preserve"> to different player’s character</w:t>
+      </w:r>
+      <w:r>
+        <w:rPr>
+          <w:b/>
+          <w:bCs/>
+        </w:rPr>
+        <w:t xml:space="preserve">. They are also 10S. This bar is initially empty (black). When an action is queued up, this bar is filled accordingly using the time that was used for that action (but no animation yet until the player </w:t>
+      </w:r>
+      <w:proofErr w:type="gramStart"/>
+      <w:r>
+        <w:rPr>
+          <w:b/>
+          <w:bCs/>
+        </w:rPr>
+        <w:t>press</w:t>
+      </w:r>
+      <w:proofErr w:type="gramEnd"/>
+      <w:r>
+        <w:rPr>
+          <w:b/>
+          <w:bCs/>
+        </w:rPr>
+        <w:t xml:space="preserve"> play). The color to fill the bar is different for each action, takedown should be red, move should be green, you think of the rest (wait is gray). When a player press play, the time will start moving and all characters start acting (enemies as scripted, player as programmed). If a guard </w:t>
+      </w:r>
+      <w:proofErr w:type="gramStart"/>
+      <w:r>
+        <w:rPr>
+          <w:b/>
+          <w:bCs/>
+        </w:rPr>
+        <w:t>see</w:t>
+      </w:r>
+      <w:proofErr w:type="gramEnd"/>
+      <w:r>
+        <w:rPr>
+          <w:b/>
+          <w:bCs/>
+        </w:rPr>
+        <w:t xml:space="preserve"> a player character in their POV, they will rush over (double speed) to catch the player. If they catch up </w:t>
+      </w:r>
+      <w:proofErr w:type="gramStart"/>
+      <w:r>
+        <w:rPr>
+          <w:b/>
+          <w:bCs/>
+        </w:rPr>
+        <w:t>to</w:t>
+      </w:r>
+      <w:proofErr w:type="gramEnd"/>
+      <w:r>
+        <w:rPr>
+          <w:b/>
+          <w:bCs/>
+        </w:rPr>
+        <w:t xml:space="preserve"> the </w:t>
+      </w:r>
+      <w:r>
+        <w:rPr>
+          <w:b/>
+          <w:bCs/>
+        </w:rPr>
+        <w:lastRenderedPageBreak/>
+        <w:t xml:space="preserve">player, that player is considered taken down (already has that implemented). </w:t>
+      </w:r>
+      <w:proofErr w:type="gramStart"/>
+      <w:r>
+        <w:rPr>
+          <w:b/>
+          <w:bCs/>
+        </w:rPr>
+        <w:t>Player</w:t>
+      </w:r>
+      <w:proofErr w:type="gramEnd"/>
+      <w:r>
+        <w:rPr>
+          <w:b/>
+          <w:bCs/>
+        </w:rPr>
+        <w:t xml:space="preserve"> can freely move the line in the movie bar back and forth to queue up different actions from that </w:t>
+      </w:r>
+      <w:proofErr w:type="gramStart"/>
+      <w:r>
+        <w:rPr>
+          <w:b/>
+          <w:bCs/>
+        </w:rPr>
+        <w:t>particular point</w:t>
+      </w:r>
+      <w:proofErr w:type="gramEnd"/>
+      <w:r>
+        <w:rPr>
+          <w:b/>
+          <w:bCs/>
+        </w:rPr>
+        <w:t xml:space="preserve"> in time, doing so will erase all queued command after that point in time but does not affect anything before that point.</w:t>
+      </w:r>
+      <w:r>
+        <w:rPr>
+          <w:b/>
+          <w:bCs/>
+        </w:rPr>
+        <w:t xml:space="preserve"> The basic guard can not shoot for now, only melee for take down.</w:t>
+      </w:r>
+    </w:p>
+    <w:p>
+      <w:pPr>
+        <w:rPr>
+          <w:b/>
+          <w:bCs/>
+        </w:rPr>
+      </w:pPr>
+      <w:r>
+        <w:rPr>
+          <w:b/>
+          <w:bCs/>
+        </w:rPr>
+        <w:t>All characters share the same timeline, 100% overlap</w:t>
+      </w:r>
     </w:p>
     <w:sectPr>
       <w:pgSz w:w="12240" w:h="15840"/>

</xml_diff>

<commit_message>
Assets and map editor
</commit_message>
<xml_diff>
--- a/Overall document.docx
+++ b/Overall document.docx
@@ -1280,104 +1280,28 @@
           <w:b/>
           <w:bCs/>
         </w:rPr>
-        <w:t xml:space="preserve"> also guards that move at a flat 5m/s. These guards will shoot at you if you </w:t>
-      </w:r>
-      <w:proofErr w:type="gramStart"/>
-      <w:r>
-        <w:rPr>
-          <w:b/>
-          <w:bCs/>
-        </w:rPr>
-        <w:t>are in</w:t>
-      </w:r>
-      <w:proofErr w:type="gramEnd"/>
-      <w:r>
-        <w:rPr>
-          <w:b/>
-          <w:bCs/>
-        </w:rPr>
-        <w:t xml:space="preserve"> </w:t>
-      </w:r>
-      <w:r>
-        <w:rPr>
-          <w:b/>
-          <w:bCs/>
-        </w:rPr>
-        <w:t>2</w:t>
-      </w:r>
-      <w:r>
-        <w:rPr>
-          <w:b/>
-          <w:bCs/>
-        </w:rPr>
-        <w:t xml:space="preserve">0m or less (but more than </w:t>
-      </w:r>
-      <w:r>
-        <w:rPr>
-          <w:b/>
-          <w:bCs/>
-        </w:rPr>
-        <w:t>0.5</w:t>
-      </w:r>
-      <w:r>
-        <w:rPr>
-          <w:b/>
-          <w:bCs/>
-        </w:rPr>
-        <w:t xml:space="preserve">m away) and it takes them 3s to shoot. If they cannot shoot you (no clear line of sight or if you are holding a hostage), they will attempt to move closer and change weapon (to a taser). Changing weapon for guard take 3s. Taser can only be used within </w:t>
-      </w:r>
-      <w:r>
-        <w:rPr>
-          <w:b/>
-          <w:bCs/>
-        </w:rPr>
-        <w:t>0.5</w:t>
-      </w:r>
-      <w:r>
-        <w:rPr>
-          <w:b/>
-          <w:bCs/>
-        </w:rPr>
-        <w:t>m and will need 2s to be used.</w:t>
-      </w:r>
-      <w:r>
-        <w:rPr>
-          <w:b/>
-          <w:bCs/>
-        </w:rPr>
-        <w:t xml:space="preserve"> If the situation </w:t>
-      </w:r>
-      <w:proofErr w:type="gramStart"/>
-      <w:r>
-        <w:rPr>
-          <w:b/>
-          <w:bCs/>
-        </w:rPr>
-        <w:t>change</w:t>
-      </w:r>
-      <w:proofErr w:type="gramEnd"/>
-      <w:r>
-        <w:rPr>
-          <w:b/>
-          <w:bCs/>
-        </w:rPr>
-        <w:t xml:space="preserve">, the guard </w:t>
-      </w:r>
-      <w:proofErr w:type="gramStart"/>
-      <w:r>
-        <w:rPr>
-          <w:b/>
-          <w:bCs/>
-        </w:rPr>
-        <w:t>get</w:t>
-      </w:r>
-      <w:proofErr w:type="gramEnd"/>
-      <w:r>
-        <w:rPr>
-          <w:b/>
-          <w:bCs/>
-        </w:rPr>
-        <w:t xml:space="preserve"> a clear </w:t>
+        <w:t xml:space="preserve"> also guards that move at a flat </w:t>
+      </w:r>
+      <w:r>
+        <w:rPr>
+          <w:b/>
+          <w:bCs/>
+        </w:rPr>
+        <w:t>1.25</w:t>
+      </w:r>
+      <w:r>
+        <w:rPr>
+          <w:b/>
+          <w:bCs/>
+        </w:rPr>
+        <w:t xml:space="preserve">m/s. </w:t>
+      </w:r>
+      <w:r>
+        <w:rPr>
+          <w:b/>
+          <w:bCs/>
+        </w:rPr>
+        <w:t xml:space="preserve">These guards will wander around on a patrol route with a cone vision (long cone, a bit narrow vision (60 degree, 10m cone, </w:t>
       </w:r>
       <w:proofErr w:type="spellStart"/>
       <w:r>
@@ -1385,7 +1309,7 @@
           <w:b/>
           <w:bCs/>
         </w:rPr>
-        <w:t>LoS</w:t>
+        <w:t>semi circle</w:t>
       </w:r>
       <w:proofErr w:type="spellEnd"/>
       <w:r>
@@ -1393,74 +1317,58 @@
           <w:b/>
           <w:bCs/>
         </w:rPr>
-        <w:t xml:space="preserve"> to you or you drop the hostage, guard might switch back their</w:t>
-      </w:r>
-      <w:r>
-        <w:rPr>
-          <w:b/>
-          <w:bCs/>
-        </w:rPr>
-        <w:t xml:space="preserve"> </w:t>
-      </w:r>
-      <w:r>
-        <w:rPr>
-          <w:b/>
-          <w:bCs/>
-        </w:rPr>
-        <w:t xml:space="preserve">weapon to shoot at you, optimizing the time that it takes to neutralize the target. </w:t>
-      </w:r>
-      <w:r>
-        <w:rPr>
-          <w:b/>
-          <w:bCs/>
-        </w:rPr>
-        <w:t>Guard</w:t>
-      </w:r>
-      <w:r>
-        <w:rPr>
-          <w:b/>
-          <w:bCs/>
-        </w:rPr>
-        <w:t>s</w:t>
-      </w:r>
-      <w:r>
-        <w:rPr>
-          <w:b/>
-          <w:bCs/>
-        </w:rPr>
-        <w:t xml:space="preserve"> also have a field of vision which is 120 </w:t>
-      </w:r>
-      <w:proofErr w:type="gramStart"/>
-      <w:r>
-        <w:rPr>
-          <w:b/>
-          <w:bCs/>
-        </w:rPr>
-        <w:t>degree</w:t>
-      </w:r>
-      <w:proofErr w:type="gramEnd"/>
-      <w:r>
-        <w:rPr>
-          <w:b/>
-          <w:bCs/>
-        </w:rPr>
-        <w:t xml:space="preserve"> to the direction they are facing and will prioritize reacting to the closest target in that </w:t>
-      </w:r>
-      <w:proofErr w:type="spellStart"/>
-      <w:r>
-        <w:rPr>
-          <w:b/>
-          <w:bCs/>
-        </w:rPr>
-        <w:t>FoV</w:t>
-      </w:r>
-      <w:proofErr w:type="spellEnd"/>
-      <w:r>
-        <w:rPr>
-          <w:b/>
-          <w:bCs/>
-        </w:rPr>
-        <w:t>.</w:t>
+        <w:t xml:space="preserve"> at the end of the cone).</w:t>
+      </w:r>
+    </w:p>
+    <w:p>
+      <w:pPr>
+        <w:rPr>
+          <w:b/>
+          <w:bCs/>
+        </w:rPr>
+      </w:pPr>
+      <w:r>
+        <w:rPr>
+          <w:b/>
+          <w:bCs/>
+        </w:rPr>
+        <w:t xml:space="preserve">Guards only need to successfully shoot or tase you once to neutralize that character. Neutralized characters can be picked up by </w:t>
+      </w:r>
+      <w:r>
+        <w:rPr>
+          <w:b/>
+          <w:bCs/>
+        </w:rPr>
+        <w:t>other characters but will put the weight of the neutralized character on the picking up character.</w:t>
+      </w:r>
+    </w:p>
+    <w:p>
+      <w:pPr>
+        <w:rPr>
+          <w:b/>
+          <w:bCs/>
+        </w:rPr>
+      </w:pPr>
+      <w:r>
+        <w:rPr>
+          <w:b/>
+          <w:bCs/>
+        </w:rPr>
+        <w:t>Test map is an isometric square with 40m edges. With 4 doors at the middle of each wall, 2 windows evenly spaced on each side of each door (8 windows in total). The windows are closed. In the middle of the room there is a locked chest (with a painting inside (10kg obj)</w:t>
+      </w:r>
+      <w:r>
+        <w:rPr>
+          <w:b/>
+          <w:bCs/>
+        </w:rPr>
+        <w:t xml:space="preserve"> Worth 3$)</w:t>
+      </w:r>
+      <w:r>
+        <w:rPr>
+          <w:b/>
+          <w:bCs/>
+        </w:rPr>
+        <w:t>. There is no level up/ quirks or item right now.</w:t>
       </w:r>
     </w:p>
     <w:p>
@@ -1476,57 +1384,6 @@
           <w:bCs/>
         </w:rPr>
         <w:lastRenderedPageBreak/>
-        <w:t xml:space="preserve">Guards only need to successfully shoot or tase you once to neutralize that character. Neutralized characters can be picked up by </w:t>
-      </w:r>
-      <w:r>
-        <w:rPr>
-          <w:b/>
-          <w:bCs/>
-        </w:rPr>
-        <w:t>other characters but will put the weight of the neutralized character on the picking up character.</w:t>
-      </w:r>
-    </w:p>
-    <w:p>
-      <w:pPr>
-        <w:rPr>
-          <w:b/>
-          <w:bCs/>
-        </w:rPr>
-      </w:pPr>
-      <w:r>
-        <w:rPr>
-          <w:b/>
-          <w:bCs/>
-        </w:rPr>
-        <w:t>Test map is an isometric square with 40m edges. With 4 doors at the middle of each wall, 2 windows evenly spaced on each side of each door (8 windows in total). The windows are closed. In the middle of the room there is a locked chest (with a painting inside (10kg obj)</w:t>
-      </w:r>
-      <w:r>
-        <w:rPr>
-          <w:b/>
-          <w:bCs/>
-        </w:rPr>
-        <w:t xml:space="preserve"> Worth 3$)</w:t>
-      </w:r>
-      <w:r>
-        <w:rPr>
-          <w:b/>
-          <w:bCs/>
-        </w:rPr>
-        <w:t>. There is no level up/ quirks or item right now.</w:t>
-      </w:r>
-    </w:p>
-    <w:p>
-      <w:pPr>
-        <w:rPr>
-          <w:b/>
-          <w:bCs/>
-        </w:rPr>
-      </w:pPr>
-      <w:r>
-        <w:rPr>
-          <w:b/>
-          <w:bCs/>
-        </w:rPr>
         <w:t>We have 3 playable characters (press tab to switch between them) top right corner there is a timer. Start at 60s and goes down by 10s each time we press commit.</w:t>
       </w:r>
     </w:p>
@@ -1903,7 +1760,23 @@
           <w:b/>
           <w:bCs/>
         </w:rPr>
-        <w:t xml:space="preserve">Once the player </w:t>
+        <w:t xml:space="preserve">Once the </w:t>
+      </w:r>
+      <w:proofErr w:type="gramStart"/>
+      <w:r>
+        <w:rPr>
+          <w:b/>
+          <w:bCs/>
+        </w:rPr>
+        <w:t>player</w:t>
+      </w:r>
+      <w:proofErr w:type="gramEnd"/>
+      <w:r>
+        <w:rPr>
+          <w:b/>
+          <w:bCs/>
+        </w:rPr>
+        <w:t xml:space="preserve"> </w:t>
       </w:r>
       <w:proofErr w:type="gramStart"/>
       <w:r>
@@ -1935,7 +1808,37 @@
           <w:b/>
           <w:bCs/>
         </w:rPr>
-        <w:t xml:space="preserve"> with their planning, they can click Predict, which would start the </w:t>
+        <w:t xml:space="preserve"> with their </w:t>
+      </w:r>
+      <w:proofErr w:type="gramStart"/>
+      <w:r>
+        <w:rPr>
+          <w:b/>
+          <w:bCs/>
+        </w:rPr>
+        <w:t>planning</w:t>
+      </w:r>
+      <w:proofErr w:type="gramEnd"/>
+      <w:r>
+        <w:rPr>
+          <w:b/>
+          <w:bCs/>
+        </w:rPr>
+        <w:t xml:space="preserve">, they can click </w:t>
+      </w:r>
+      <w:r>
+        <w:rPr>
+          <w:b/>
+          <w:bCs/>
+        </w:rPr>
+        <w:t xml:space="preserve">Commit, </w:t>
+      </w:r>
+      <w:r>
+        <w:rPr>
+          <w:b/>
+          <w:bCs/>
+        </w:rPr>
+        <w:t xml:space="preserve">would start the </w:t>
       </w:r>
       <w:proofErr w:type="gramStart"/>
       <w:r>
@@ -1951,23 +1854,7 @@
           <w:b/>
           <w:bCs/>
         </w:rPr>
-        <w:t xml:space="preserve"> action (using logic above, each enemy also </w:t>
-      </w:r>
-      <w:proofErr w:type="gramStart"/>
-      <w:r>
-        <w:rPr>
-          <w:b/>
-          <w:bCs/>
-        </w:rPr>
-        <w:t>have</w:t>
-      </w:r>
-      <w:proofErr w:type="gramEnd"/>
-      <w:r>
-        <w:rPr>
-          <w:b/>
-          <w:bCs/>
-        </w:rPr>
-        <w:t xml:space="preserve"> 10s worth of action).</w:t>
+        <w:t xml:space="preserve"> action (using logic above, each enemy also have 10s worth of action).</w:t>
       </w:r>
     </w:p>
     <w:p>
@@ -1987,101 +1874,71 @@
           <w:b/>
           <w:bCs/>
         </w:rPr>
+        <w:t>We then go to the next turn.</w:t>
+      </w:r>
+    </w:p>
+    <w:p>
+      <w:pPr>
+        <w:ind w:left="360"/>
+        <w:rPr>
+          <w:b/>
+          <w:bCs/>
+        </w:rPr>
+      </w:pPr>
+    </w:p>
+    <w:p>
+      <w:pPr>
+        <w:rPr>
+          <w:b/>
+          <w:bCs/>
+        </w:rPr>
+      </w:pPr>
+      <w:r>
+        <w:rPr>
+          <w:b/>
+          <w:bCs/>
+        </w:rPr>
+        <w:t xml:space="preserve">Player UI: When a character is selected, there will be an avatar at the bottom of the screen with their time left (green neon, like a health bar) that goes down every time they take an action. This bar </w:t>
+      </w:r>
+      <w:proofErr w:type="gramStart"/>
+      <w:r>
+        <w:rPr>
+          <w:b/>
+          <w:bCs/>
+        </w:rPr>
+        <w:t>represent</w:t>
+      </w:r>
+      <w:proofErr w:type="gramEnd"/>
+      <w:r>
+        <w:rPr>
+          <w:b/>
+          <w:bCs/>
+        </w:rPr>
+        <w:t xml:space="preserve"> 10.0s and goes down according to the time the character used. Undoing actions will refund this time and refill the bar. Inside the bar there is a number in black that shows the time left this turn. If the player </w:t>
+      </w:r>
+      <w:proofErr w:type="gramStart"/>
+      <w:r>
+        <w:rPr>
+          <w:b/>
+          <w:bCs/>
+        </w:rPr>
+        <w:t>hover</w:t>
+      </w:r>
+      <w:proofErr w:type="gramEnd"/>
+      <w:r>
+        <w:rPr>
+          <w:b/>
+          <w:bCs/>
+        </w:rPr>
+        <w:t xml:space="preserve"> their </w:t>
+      </w:r>
+      <w:r>
+        <w:rPr>
+          <w:b/>
+          <w:bCs/>
+        </w:rPr>
         <w:lastRenderedPageBreak/>
-        <w:t>At the end of “predict”, player can choose to commit, which will confirm all that actions (both player’s and enemies’) or Back to Planning, which will</w:t>
-      </w:r>
-      <w:r>
-        <w:rPr>
-          <w:b/>
-          <w:bCs/>
-        </w:rPr>
-        <w:t xml:space="preserve"> undo all the </w:t>
-      </w:r>
-      <w:proofErr w:type="gramStart"/>
-      <w:r>
-        <w:rPr>
-          <w:b/>
-          <w:bCs/>
-        </w:rPr>
-        <w:t>enemies</w:t>
-      </w:r>
-      <w:proofErr w:type="gramEnd"/>
-      <w:r>
-        <w:rPr>
-          <w:b/>
-          <w:bCs/>
-        </w:rPr>
-        <w:t xml:space="preserve"> action and go back to the last stage of “Planning”, from here player can Undo </w:t>
-      </w:r>
-      <w:proofErr w:type="gramStart"/>
-      <w:r>
-        <w:rPr>
-          <w:b/>
-          <w:bCs/>
-        </w:rPr>
-        <w:t>Or</w:t>
-      </w:r>
-      <w:proofErr w:type="gramEnd"/>
-      <w:r>
-        <w:rPr>
-          <w:b/>
-          <w:bCs/>
-        </w:rPr>
-        <w:t xml:space="preserve"> Reset agai</w:t>
-      </w:r>
-      <w:r>
-        <w:rPr>
-          <w:b/>
-          <w:bCs/>
-        </w:rPr>
-        <w:t>n.</w:t>
-      </w:r>
-    </w:p>
-    <w:p>
-      <w:pPr>
-        <w:rPr>
-          <w:b/>
-          <w:bCs/>
-        </w:rPr>
-      </w:pPr>
-      <w:r>
-        <w:rPr>
-          <w:b/>
-          <w:bCs/>
-        </w:rPr>
-        <w:t xml:space="preserve">Player UI: When a character is selected, there will be an avatar at the bottom of the screen with their time left (green neon, like a health bar) that goes down every time they take an action. This bar </w:t>
-      </w:r>
-      <w:proofErr w:type="gramStart"/>
-      <w:r>
-        <w:rPr>
-          <w:b/>
-          <w:bCs/>
-        </w:rPr>
-        <w:t>represent</w:t>
-      </w:r>
-      <w:proofErr w:type="gramEnd"/>
-      <w:r>
-        <w:rPr>
-          <w:b/>
-          <w:bCs/>
-        </w:rPr>
-        <w:t xml:space="preserve"> 10.0s and goes down according to the time the character used. Undoing actions will refund this time and refill the bar. Inside the bar there is a number in black that shows the time left this turn. If the player </w:t>
-      </w:r>
-      <w:proofErr w:type="gramStart"/>
-      <w:r>
-        <w:rPr>
-          <w:b/>
-          <w:bCs/>
-        </w:rPr>
-        <w:t>hover</w:t>
-      </w:r>
-      <w:proofErr w:type="gramEnd"/>
-      <w:r>
-        <w:rPr>
-          <w:b/>
-          <w:bCs/>
-        </w:rPr>
-        <w:t xml:space="preserve"> their mouse over the avatar, a small table will pop up to show all the speed affecting status. For </w:t>
+        <w:t xml:space="preserve">mouse over the avatar, a small table will pop up to show all the speed affecting status. For </w:t>
       </w:r>
       <w:proofErr w:type="gramStart"/>
       <w:r>
@@ -2373,265 +2230,6 @@
           <w:bCs/>
         </w:rPr>
       </w:pPr>
-      <w:proofErr w:type="gramStart"/>
-      <w:r>
-        <w:rPr>
-          <w:b/>
-          <w:bCs/>
-        </w:rPr>
-        <w:t>New turn</w:t>
-      </w:r>
-      <w:proofErr w:type="gramEnd"/>
-      <w:r>
-        <w:rPr>
-          <w:b/>
-          <w:bCs/>
-        </w:rPr>
-        <w:t xml:space="preserve"> order: There will be a 10s bar that is used for all characters. (This bar is on the bottom of the screen about 20When time </w:t>
-      </w:r>
-      <w:proofErr w:type="gramStart"/>
-      <w:r>
-        <w:rPr>
-          <w:b/>
-          <w:bCs/>
-        </w:rPr>
-        <w:t>move</w:t>
-      </w:r>
-      <w:proofErr w:type="gramEnd"/>
-      <w:r>
-        <w:rPr>
-          <w:b/>
-          <w:bCs/>
-        </w:rPr>
-        <w:t xml:space="preserve"> and this bar fills </w:t>
-      </w:r>
-      <w:proofErr w:type="gramStart"/>
-      <w:r>
-        <w:rPr>
-          <w:b/>
-          <w:bCs/>
-        </w:rPr>
-        <w:t>up,</w:t>
-      </w:r>
-      <w:proofErr w:type="gramEnd"/>
-      <w:r>
-        <w:rPr>
-          <w:b/>
-          <w:bCs/>
-        </w:rPr>
-        <w:t xml:space="preserve"> enemies will move as scripted and player’s characters will move as programmed. The default move for the character is </w:t>
-      </w:r>
-      <w:proofErr w:type="gramStart"/>
-      <w:r>
-        <w:rPr>
-          <w:b/>
-          <w:bCs/>
-        </w:rPr>
-        <w:t>wait</w:t>
-      </w:r>
-      <w:proofErr w:type="gramEnd"/>
-      <w:r>
-        <w:rPr>
-          <w:b/>
-          <w:bCs/>
-        </w:rPr>
-        <w:t xml:space="preserve"> (do nothing) until there is a new command.</w:t>
-      </w:r>
-    </w:p>
-    <w:p>
-      <w:pPr>
-        <w:rPr>
-          <w:b/>
-          <w:bCs/>
-        </w:rPr>
-      </w:pPr>
-      <w:r>
-        <w:rPr>
-          <w:b/>
-          <w:bCs/>
-        </w:rPr>
-        <w:t xml:space="preserve">This 10s bar is like a </w:t>
-      </w:r>
-      <w:proofErr w:type="gramStart"/>
-      <w:r>
-        <w:rPr>
-          <w:b/>
-          <w:bCs/>
-        </w:rPr>
-        <w:t>movie,</w:t>
-      </w:r>
-      <w:proofErr w:type="gramEnd"/>
-      <w:r>
-        <w:rPr>
-          <w:b/>
-          <w:bCs/>
-        </w:rPr>
-        <w:t xml:space="preserve"> you can move it back and forth by dragging the line that </w:t>
-      </w:r>
-      <w:proofErr w:type="gramStart"/>
-      <w:r>
-        <w:rPr>
-          <w:b/>
-          <w:bCs/>
-        </w:rPr>
-        <w:t>run</w:t>
-      </w:r>
-      <w:proofErr w:type="gramEnd"/>
-      <w:r>
-        <w:rPr>
-          <w:b/>
-          <w:bCs/>
-        </w:rPr>
-        <w:t xml:space="preserve"> in the bar.</w:t>
-      </w:r>
-    </w:p>
-    <w:p>
-      <w:pPr>
-        <w:rPr>
-          <w:b/>
-          <w:bCs/>
-        </w:rPr>
-      </w:pPr>
-      <w:r>
-        <w:rPr>
-          <w:b/>
-          <w:bCs/>
-        </w:rPr>
-        <w:t xml:space="preserve">Under the bar, there are 3 more bars that </w:t>
-      </w:r>
-      <w:proofErr w:type="gramStart"/>
-      <w:r>
-        <w:rPr>
-          <w:b/>
-          <w:bCs/>
-        </w:rPr>
-        <w:t>belongs</w:t>
-      </w:r>
-      <w:proofErr w:type="gramEnd"/>
-      <w:r>
-        <w:rPr>
-          <w:b/>
-          <w:bCs/>
-        </w:rPr>
-        <w:t xml:space="preserve"> to different player’s character</w:t>
-      </w:r>
-      <w:r>
-        <w:rPr>
-          <w:b/>
-          <w:bCs/>
-        </w:rPr>
-        <w:t xml:space="preserve">. They are also 10S. This bar is initially empty (black). When an action is queued up, this bar is filled accordingly using the time that was used for that action (but no animation yet until the player </w:t>
-      </w:r>
-      <w:proofErr w:type="gramStart"/>
-      <w:r>
-        <w:rPr>
-          <w:b/>
-          <w:bCs/>
-        </w:rPr>
-        <w:t>press</w:t>
-      </w:r>
-      <w:proofErr w:type="gramEnd"/>
-      <w:r>
-        <w:rPr>
-          <w:b/>
-          <w:bCs/>
-        </w:rPr>
-        <w:t xml:space="preserve"> play). The color to fill the bar is different for each action, takedown should be red, move should be green, you think of the rest (wait is gray). When a player press play, the time will start moving and all characters start acting (enemies as scripted, player as programmed). If a guard </w:t>
-      </w:r>
-      <w:proofErr w:type="gramStart"/>
-      <w:r>
-        <w:rPr>
-          <w:b/>
-          <w:bCs/>
-        </w:rPr>
-        <w:t>see</w:t>
-      </w:r>
-      <w:proofErr w:type="gramEnd"/>
-      <w:r>
-        <w:rPr>
-          <w:b/>
-          <w:bCs/>
-        </w:rPr>
-        <w:t xml:space="preserve"> a player character in their POV, they will rush over (double speed) to catch the player. If they catch up </w:t>
-      </w:r>
-      <w:proofErr w:type="gramStart"/>
-      <w:r>
-        <w:rPr>
-          <w:b/>
-          <w:bCs/>
-        </w:rPr>
-        <w:t>to</w:t>
-      </w:r>
-      <w:proofErr w:type="gramEnd"/>
-      <w:r>
-        <w:rPr>
-          <w:b/>
-          <w:bCs/>
-        </w:rPr>
-        <w:t xml:space="preserve"> the </w:t>
-      </w:r>
-      <w:r>
-        <w:rPr>
-          <w:b/>
-          <w:bCs/>
-        </w:rPr>
-        <w:lastRenderedPageBreak/>
-        <w:t xml:space="preserve">player, that player is considered taken down (already has that implemented). </w:t>
-      </w:r>
-      <w:proofErr w:type="gramStart"/>
-      <w:r>
-        <w:rPr>
-          <w:b/>
-          <w:bCs/>
-        </w:rPr>
-        <w:t>Player</w:t>
-      </w:r>
-      <w:proofErr w:type="gramEnd"/>
-      <w:r>
-        <w:rPr>
-          <w:b/>
-          <w:bCs/>
-        </w:rPr>
-        <w:t xml:space="preserve"> can freely move the line in the movie bar back and forth to queue up different actions from that </w:t>
-      </w:r>
-      <w:proofErr w:type="gramStart"/>
-      <w:r>
-        <w:rPr>
-          <w:b/>
-          <w:bCs/>
-        </w:rPr>
-        <w:t>particular point</w:t>
-      </w:r>
-      <w:proofErr w:type="gramEnd"/>
-      <w:r>
-        <w:rPr>
-          <w:b/>
-          <w:bCs/>
-        </w:rPr>
-        <w:t xml:space="preserve"> in time, doing so will erase all queued command after that point in time but does not affect anything before that point.</w:t>
-      </w:r>
-      <w:r>
-        <w:rPr>
-          <w:b/>
-          <w:bCs/>
-        </w:rPr>
-        <w:t xml:space="preserve"> The basic guard can not shoot for now, only melee for take down.</w:t>
-      </w:r>
-    </w:p>
-    <w:p>
-      <w:pPr>
-        <w:rPr>
-          <w:b/>
-          <w:bCs/>
-        </w:rPr>
-      </w:pPr>
-      <w:r>
-        <w:rPr>
-          <w:b/>
-          <w:bCs/>
-        </w:rPr>
-        <w:t>All characters share the same timeline, 100% overlap</w:t>
-      </w:r>
     </w:p>
     <w:sectPr>
       <w:pgSz w:w="12240" w:h="15840"/>

</xml_diff>